<commit_message>
Updated document variable names
</commit_message>
<xml_diff>
--- a/docs/BuffCapstone_AB.docx
+++ b/docs/BuffCapstone_AB.docx
@@ -226,7 +226,7 @@
       </w:pPr>
       <w:r>
         <w:rPr>
-          <w:rFonts w:eastAsia="Times New Roman" w:cs="Times New Roman" w:ascii="Times New Roman" w:hAnsi="Times New Roman"/>
+          <w:rFonts w:eastAsia="Times New Roman" w:cs="Times New Roman"/>
           <w:b/>
           <w:bCs/>
           <w:sz w:val="32"/>
@@ -297,15 +297,7 @@
           <w:sz w:val="24"/>
           <w:szCs w:val="24"/>
         </w:rPr>
-        <w:t xml:space="preserve">From: Zachary Buffington, </w:t>
-      </w:r>
-      <w:r>
-        <w:rPr>
-          <w:rFonts w:eastAsia="Times New Roman" w:cs="Times New Roman"/>
-          <w:sz w:val="24"/>
-          <w:szCs w:val="24"/>
-        </w:rPr>
-        <w:t>Machine Learning Engineer</w:t>
+        <w:t>From: Zachary Buffington, Machine Learning Engineer</w:t>
       </w:r>
     </w:p>
     <w:p>
@@ -345,23 +337,7 @@
           <w:sz w:val="24"/>
           <w:szCs w:val="24"/>
         </w:rPr>
-        <w:t xml:space="preserve">Dear </w:t>
-      </w:r>
-      <w:r>
-        <w:rPr>
-          <w:rFonts w:eastAsia="Times New Roman" w:cs="Times New Roman"/>
-          <w:sz w:val="24"/>
-          <w:szCs w:val="24"/>
-        </w:rPr>
-        <w:t>executives</w:t>
-      </w:r>
-      <w:r>
-        <w:rPr>
-          <w:rFonts w:eastAsia="Times New Roman" w:cs="Times New Roman"/>
-          <w:sz w:val="24"/>
-          <w:szCs w:val="24"/>
-        </w:rPr>
-        <w:t>,</w:t>
+        <w:t>Dear executives,</w:t>
       </w:r>
     </w:p>
     <w:p>
@@ -448,23 +424,7 @@
           <w:sz w:val="24"/>
           <w:szCs w:val="24"/>
         </w:rPr>
-        <w:t xml:space="preserve">The proposed product uses a random forest classifier trained on player demographic </w:t>
-      </w:r>
-      <w:r>
-        <w:rPr>
-          <w:rFonts w:eastAsia="Times New Roman" w:cs="Times New Roman"/>
-          <w:sz w:val="24"/>
-          <w:szCs w:val="24"/>
-        </w:rPr>
-        <w:t xml:space="preserve">and behavioral </w:t>
-      </w:r>
-      <w:r>
-        <w:rPr>
-          <w:rFonts w:eastAsia="Times New Roman" w:cs="Times New Roman"/>
-          <w:sz w:val="24"/>
-          <w:szCs w:val="24"/>
-        </w:rPr>
-        <w:t>data to predict whether a given player falls into the whale, dolphin, or minnow spending category (corresponding to high-, moderate-, and low-value players, respectively). The system will provide an interactive dashboard with classification results, feature importance analysis, and exploration tools that allow product managers and marketing leads to act on the model's predictions without requiring technical expertise.</w:t>
+        <w:t>The proposed product uses a random forest classifier trained on player demographic and behavioral data to predict whether a given player falls into the whale, dolphin, or minnow spending category (corresponding to high-, moderate-, and low-value players, respectively). The system will provide an interactive dashboard with classification results, feature importance analysis, and exploration tools that allow product managers and marketing leads to act on the model's predictions without requiring technical expertise.</w:t>
       </w:r>
     </w:p>
     <w:p>
@@ -592,7 +552,7 @@
       </w:pPr>
       <w:r>
         <w:rPr>
-          <w:rFonts w:eastAsia="Times New Roman" w:cs="Times New Roman" w:ascii="Times New Roman" w:hAnsi="Times New Roman"/>
+          <w:rFonts w:eastAsia="Times New Roman" w:cs="Times New Roman"/>
           <w:b/>
           <w:bCs/>
           <w:sz w:val="32"/>
@@ -619,7 +579,7 @@
       </w:pPr>
       <w:r>
         <w:rPr>
-          <w:rFonts w:eastAsia="Times New Roman" w:cs="Times New Roman" w:ascii="Times New Roman" w:hAnsi="Times New Roman"/>
+          <w:rFonts w:eastAsia="Times New Roman" w:cs="Times New Roman"/>
           <w:b/>
           <w:bCs/>
           <w:sz w:val="28"/>
@@ -723,7 +683,7 @@
       </w:pPr>
       <w:r>
         <w:rPr>
-          <w:rFonts w:eastAsia="Times New Roman" w:cs="Times New Roman" w:ascii="Times New Roman" w:hAnsi="Times New Roman"/>
+          <w:rFonts w:eastAsia="Times New Roman" w:cs="Times New Roman"/>
           <w:b/>
           <w:bCs/>
           <w:sz w:val="28"/>
@@ -888,7 +848,7 @@
       </w:pPr>
       <w:r>
         <w:rPr>
-          <w:rFonts w:eastAsia="Times New Roman" w:cs="Times New Roman" w:ascii="Times New Roman" w:hAnsi="Times New Roman"/>
+          <w:rFonts w:eastAsia="Times New Roman" w:cs="Times New Roman"/>
           <w:b/>
           <w:bCs/>
           <w:sz w:val="28"/>
@@ -1087,23 +1047,7 @@
           <w:sz w:val="24"/>
           <w:szCs w:val="24"/>
         </w:rPr>
-        <w:t xml:space="preserve">Section </w:t>
-      </w:r>
-      <w:r>
-        <w:rPr>
-          <w:rFonts w:eastAsia="Times New Roman" w:cs="Times New Roman"/>
-          <w:sz w:val="24"/>
-          <w:szCs w:val="24"/>
-        </w:rPr>
-        <w:t>six</w:t>
-      </w:r>
-      <w:r>
-        <w:rPr>
-          <w:rFonts w:eastAsia="Times New Roman" w:cs="Times New Roman"/>
-          <w:sz w:val="24"/>
-          <w:szCs w:val="24"/>
-        </w:rPr>
-        <w:t xml:space="preserve"> formally evaluates the project hypothesis and null hypothesis against the experimental results from section four, followed by a discussion.</w:t>
+        <w:t>Section six formally evaluates the project hypothesis and null hypothesis against the experimental results from section four, followed by a discussion.</w:t>
       </w:r>
     </w:p>
     <w:p>
@@ -1132,7 +1076,7 @@
       </w:pPr>
       <w:r>
         <w:rPr>
-          <w:rFonts w:eastAsia="Times New Roman" w:cs="Times New Roman" w:ascii="Times New Roman" w:hAnsi="Times New Roman"/>
+          <w:rFonts w:eastAsia="Times New Roman" w:cs="Times New Roman"/>
           <w:b/>
           <w:bCs/>
           <w:sz w:val="28"/>
@@ -1222,7 +1166,7 @@
       </w:pPr>
       <w:r>
         <w:rPr>
-          <w:rFonts w:eastAsia="Times New Roman" w:cs="Times New Roman" w:ascii="Times New Roman" w:hAnsi="Times New Roman"/>
+          <w:rFonts w:eastAsia="Times New Roman" w:cs="Times New Roman"/>
           <w:b/>
           <w:bCs/>
           <w:sz w:val="28"/>
@@ -1287,7 +1231,7 @@
       </w:pPr>
       <w:r>
         <w:rPr>
-          <w:rFonts w:eastAsia="Times New Roman" w:cs="Times New Roman" w:ascii="Times New Roman" w:hAnsi="Times New Roman"/>
+          <w:rFonts w:eastAsia="Times New Roman" w:cs="Times New Roman"/>
           <w:b/>
           <w:bCs/>
           <w:sz w:val="28"/>
@@ -1518,17 +1462,7 @@
           <w:szCs w:val="24"/>
           <w:shd w:fill="auto" w:val="clear"/>
         </w:rPr>
-        <w:t xml:space="preserve">Assess all models using precision, recall, F1-score, and confusion matrices. Conduct SHAP analysis on the best-performing model to produce global and local feature importance rankings. Compare results against the predefined success criteria. </w:t>
-      </w:r>
-      <w:r>
-        <w:rPr>
-          <w:rFonts w:eastAsia="Times New Roman" w:cs="Times New Roman"/>
-          <w:color w:val="0E101A"/>
-          <w:sz w:val="24"/>
-          <w:szCs w:val="24"/>
-          <w:shd w:fill="auto" w:val="clear"/>
-        </w:rPr>
-        <w:t>Conduct a feature dependency analysis by retraining the model with InAppPurchaseAmount included to quantify the contribution of that single feature and assess the predictive value of the remaining attributes.</w:t>
+        <w:t>Assess all models using precision, recall, F1-score, and confusion matrices. Conduct SHAP analysis on the best-performing model to produce global and local feature importance rankings. Compare results against the predefined success criteria. Conduct a feature dependency analysis by retraining the model with InAppPurchaseAmount included to quantify the contribution of that single feature and assess the predictive value of the remaining attributes.</w:t>
       </w:r>
     </w:p>
     <w:p>
@@ -1591,7 +1525,7 @@
       </w:pPr>
       <w:r>
         <w:rPr>
-          <w:rFonts w:eastAsia="Times New Roman" w:cs="Times New Roman" w:ascii="Times New Roman" w:hAnsi="Times New Roman"/>
+          <w:rFonts w:eastAsia="Times New Roman" w:cs="Times New Roman"/>
           <w:b/>
           <w:bCs/>
           <w:sz w:val="28"/>
@@ -1658,7 +1592,7 @@
       </w:pPr>
       <w:r>
         <w:rPr>
-          <w:rFonts w:eastAsia="Times New Roman" w:cs="Times New Roman" w:ascii="Times New Roman" w:hAnsi="Times New Roman"/>
+          <w:rFonts w:eastAsia="Times New Roman" w:cs="Times New Roman"/>
           <w:b/>
           <w:bCs/>
           <w:sz w:val="28"/>
@@ -1775,7 +1709,7 @@
       </w:pPr>
       <w:r>
         <w:rPr>
-          <w:rFonts w:eastAsia="Times New Roman" w:cs="Times New Roman" w:ascii="Times New Roman" w:hAnsi="Times New Roman"/>
+          <w:rFonts w:eastAsia="Times New Roman" w:cs="Times New Roman"/>
           <w:b/>
           <w:bCs/>
           <w:sz w:val="28"/>
@@ -2027,7 +1961,7 @@
       </w:pPr>
       <w:r>
         <w:rPr>
-          <w:rFonts w:eastAsia="Times New Roman" w:cs="Times New Roman" w:ascii="Times New Roman" w:hAnsi="Times New Roman"/>
+          <w:rFonts w:eastAsia="Times New Roman" w:cs="Times New Roman"/>
           <w:b/>
           <w:bCs/>
           <w:sz w:val="28"/>
@@ -2071,7 +2005,7 @@
       </w:pPr>
       <w:r>
         <w:rPr>
-          <w:rFonts w:eastAsia="Times New Roman" w:cs="Times New Roman" w:ascii="Times New Roman" w:hAnsi="Times New Roman"/>
+          <w:rFonts w:eastAsia="Times New Roman" w:cs="Times New Roman"/>
           <w:b/>
           <w:bCs/>
           <w:sz w:val="32"/>
@@ -2098,7 +2032,7 @@
       </w:pPr>
       <w:r>
         <w:rPr>
-          <w:rFonts w:eastAsia="Times New Roman" w:cs="Times New Roman" w:ascii="Times New Roman" w:hAnsi="Times New Roman"/>
+          <w:rFonts w:eastAsia="Times New Roman" w:cs="Times New Roman"/>
           <w:b/>
           <w:bCs/>
           <w:sz w:val="28"/>
@@ -2165,7 +2099,7 @@
       </w:pPr>
       <w:r>
         <w:rPr>
-          <w:rFonts w:eastAsia="Times New Roman" w:cs="Times New Roman" w:ascii="Times New Roman" w:hAnsi="Times New Roman"/>
+          <w:rFonts w:eastAsia="Times New Roman" w:cs="Times New Roman"/>
           <w:b/>
           <w:bCs/>
           <w:sz w:val="28"/>
@@ -2232,7 +2166,7 @@
       </w:pPr>
       <w:r>
         <w:rPr>
-          <w:rFonts w:eastAsia="Times New Roman" w:cs="Times New Roman" w:ascii="Times New Roman" w:hAnsi="Times New Roman"/>
+          <w:rFonts w:eastAsia="Times New Roman" w:cs="Times New Roman"/>
           <w:b/>
           <w:bCs/>
           <w:sz w:val="28"/>
@@ -2299,7 +2233,7 @@
       </w:pPr>
       <w:r>
         <w:rPr>
-          <w:rFonts w:eastAsia="Times New Roman" w:cs="Times New Roman" w:ascii="Times New Roman" w:hAnsi="Times New Roman"/>
+          <w:rFonts w:eastAsia="Times New Roman" w:cs="Times New Roman"/>
           <w:b/>
           <w:bCs/>
           <w:sz w:val="28"/>
@@ -2419,7 +2353,7 @@
       </w:pPr>
       <w:r>
         <w:rPr>
-          <w:rFonts w:eastAsia="Times New Roman" w:cs="Times New Roman" w:ascii="Times New Roman" w:hAnsi="Times New Roman"/>
+          <w:rFonts w:eastAsia="Times New Roman" w:cs="Times New Roman"/>
           <w:b/>
           <w:bCs/>
           <w:sz w:val="28"/>
@@ -2502,7 +2436,7 @@
       </w:pPr>
       <w:r>
         <w:rPr>
-          <w:rFonts w:eastAsia="Times New Roman" w:cs="Times New Roman" w:ascii="Times New Roman" w:hAnsi="Times New Roman"/>
+          <w:rFonts w:eastAsia="Times New Roman" w:cs="Times New Roman"/>
           <w:b/>
           <w:bCs/>
           <w:sz w:val="28"/>
@@ -2622,7 +2556,7 @@
       </w:pPr>
       <w:r>
         <w:rPr>
-          <w:rFonts w:eastAsia="Times New Roman" w:cs="Times New Roman" w:ascii="Times New Roman" w:hAnsi="Times New Roman"/>
+          <w:rFonts w:eastAsia="Times New Roman" w:cs="Times New Roman"/>
           <w:b/>
           <w:bCs/>
           <w:sz w:val="28"/>
@@ -2779,7 +2713,7 @@
       </w:pPr>
       <w:r>
         <w:rPr>
-          <w:rFonts w:eastAsia="Times New Roman" w:cs="Times New Roman" w:ascii="Times New Roman" w:hAnsi="Times New Roman"/>
+          <w:rFonts w:eastAsia="Times New Roman" w:cs="Times New Roman"/>
           <w:b/>
           <w:bCs/>
           <w:sz w:val="28"/>
@@ -2899,7 +2833,7 @@
       </w:pPr>
       <w:r>
         <w:rPr>
-          <w:rFonts w:eastAsia="Times New Roman" w:cs="Times New Roman" w:ascii="Times New Roman" w:hAnsi="Times New Roman"/>
+          <w:rFonts w:eastAsia="Times New Roman" w:cs="Times New Roman"/>
           <w:b/>
           <w:bCs/>
           <w:sz w:val="28"/>
@@ -2983,7 +2917,7 @@
       </w:pPr>
       <w:r>
         <w:rPr>
-          <w:rFonts w:eastAsia="Times New Roman" w:cs="Times New Roman" w:ascii="Times New Roman" w:hAnsi="Times New Roman"/>
+          <w:rFonts w:eastAsia="Times New Roman" w:cs="Times New Roman"/>
           <w:b/>
           <w:bCs/>
           <w:sz w:val="28"/>
@@ -3031,20 +2965,20 @@
         </w:tblCellMar>
       </w:tblPr>
       <w:tblGrid>
-        <w:gridCol w:w="499"/>
-        <w:gridCol w:w="2201"/>
+        <w:gridCol w:w="498"/>
+        <w:gridCol w:w="2202"/>
         <w:gridCol w:w="1100"/>
         <w:gridCol w:w="1099"/>
         <w:gridCol w:w="701"/>
-        <w:gridCol w:w="1099"/>
-        <w:gridCol w:w="1300"/>
+        <w:gridCol w:w="1098"/>
+        <w:gridCol w:w="1301"/>
         <w:gridCol w:w="1361"/>
       </w:tblGrid>
       <w:tr>
         <w:trPr/>
         <w:tc>
           <w:tcPr>
-            <w:tcW w:w="499" w:type="dxa"/>
+            <w:tcW w:w="498" w:type="dxa"/>
             <w:tcBorders>
               <w:top w:val="single" w:sz="2" w:space="0" w:color="999999"/>
               <w:start w:val="single" w:sz="2" w:space="0" w:color="999999"/>
@@ -3072,7 +3006,7 @@
         </w:tc>
         <w:tc>
           <w:tcPr>
-            <w:tcW w:w="2201" w:type="dxa"/>
+            <w:tcW w:w="2202" w:type="dxa"/>
             <w:tcBorders>
               <w:top w:val="single" w:sz="2" w:space="0" w:color="999999"/>
               <w:start w:val="single" w:sz="2" w:space="0" w:color="999999"/>
@@ -3184,7 +3118,7 @@
         </w:tc>
         <w:tc>
           <w:tcPr>
-            <w:tcW w:w="1099" w:type="dxa"/>
+            <w:tcW w:w="1098" w:type="dxa"/>
             <w:tcBorders>
               <w:top w:val="single" w:sz="2" w:space="0" w:color="999999"/>
               <w:start w:val="single" w:sz="2" w:space="0" w:color="999999"/>
@@ -3212,7 +3146,7 @@
         </w:tc>
         <w:tc>
           <w:tcPr>
-            <w:tcW w:w="1300" w:type="dxa"/>
+            <w:tcW w:w="1301" w:type="dxa"/>
             <w:tcBorders>
               <w:top w:val="single" w:sz="2" w:space="0" w:color="999999"/>
               <w:start w:val="single" w:sz="2" w:space="0" w:color="999999"/>
@@ -3271,7 +3205,7 @@
         <w:trPr/>
         <w:tc>
           <w:tcPr>
-            <w:tcW w:w="499" w:type="dxa"/>
+            <w:tcW w:w="498" w:type="dxa"/>
             <w:tcBorders>
               <w:top w:val="single" w:sz="2" w:space="0" w:color="999999"/>
               <w:start w:val="single" w:sz="2" w:space="0" w:color="999999"/>
@@ -3298,7 +3232,7 @@
         </w:tc>
         <w:tc>
           <w:tcPr>
-            <w:tcW w:w="2201" w:type="dxa"/>
+            <w:tcW w:w="2202" w:type="dxa"/>
             <w:tcBorders>
               <w:top w:val="single" w:sz="2" w:space="0" w:color="999999"/>
               <w:start w:val="single" w:sz="2" w:space="0" w:color="999999"/>
@@ -3406,7 +3340,7 @@
         </w:tc>
         <w:tc>
           <w:tcPr>
-            <w:tcW w:w="1099" w:type="dxa"/>
+            <w:tcW w:w="1098" w:type="dxa"/>
             <w:tcBorders>
               <w:top w:val="single" w:sz="2" w:space="0" w:color="999999"/>
               <w:start w:val="single" w:sz="2" w:space="0" w:color="999999"/>
@@ -3433,7 +3367,7 @@
         </w:tc>
         <w:tc>
           <w:tcPr>
-            <w:tcW w:w="1300" w:type="dxa"/>
+            <w:tcW w:w="1301" w:type="dxa"/>
             <w:tcBorders>
               <w:top w:val="single" w:sz="2" w:space="0" w:color="999999"/>
               <w:start w:val="single" w:sz="2" w:space="0" w:color="999999"/>
@@ -3490,7 +3424,7 @@
         <w:trPr/>
         <w:tc>
           <w:tcPr>
-            <w:tcW w:w="499" w:type="dxa"/>
+            <w:tcW w:w="498" w:type="dxa"/>
             <w:tcBorders>
               <w:top w:val="single" w:sz="2" w:space="0" w:color="999999"/>
               <w:start w:val="single" w:sz="2" w:space="0" w:color="999999"/>
@@ -3517,7 +3451,7 @@
         </w:tc>
         <w:tc>
           <w:tcPr>
-            <w:tcW w:w="2201" w:type="dxa"/>
+            <w:tcW w:w="2202" w:type="dxa"/>
             <w:tcBorders>
               <w:top w:val="single" w:sz="2" w:space="0" w:color="999999"/>
               <w:start w:val="single" w:sz="2" w:space="0" w:color="999999"/>
@@ -3625,7 +3559,7 @@
         </w:tc>
         <w:tc>
           <w:tcPr>
-            <w:tcW w:w="1099" w:type="dxa"/>
+            <w:tcW w:w="1098" w:type="dxa"/>
             <w:tcBorders>
               <w:top w:val="single" w:sz="2" w:space="0" w:color="999999"/>
               <w:start w:val="single" w:sz="2" w:space="0" w:color="999999"/>
@@ -3652,7 +3586,7 @@
         </w:tc>
         <w:tc>
           <w:tcPr>
-            <w:tcW w:w="1300" w:type="dxa"/>
+            <w:tcW w:w="1301" w:type="dxa"/>
             <w:tcBorders>
               <w:top w:val="single" w:sz="2" w:space="0" w:color="999999"/>
               <w:start w:val="single" w:sz="2" w:space="0" w:color="999999"/>
@@ -3709,7 +3643,7 @@
         <w:trPr/>
         <w:tc>
           <w:tcPr>
-            <w:tcW w:w="499" w:type="dxa"/>
+            <w:tcW w:w="498" w:type="dxa"/>
             <w:tcBorders>
               <w:top w:val="single" w:sz="2" w:space="0" w:color="999999"/>
               <w:start w:val="single" w:sz="2" w:space="0" w:color="999999"/>
@@ -3736,7 +3670,7 @@
         </w:tc>
         <w:tc>
           <w:tcPr>
-            <w:tcW w:w="2201" w:type="dxa"/>
+            <w:tcW w:w="2202" w:type="dxa"/>
             <w:tcBorders>
               <w:top w:val="single" w:sz="2" w:space="0" w:color="999999"/>
               <w:start w:val="single" w:sz="2" w:space="0" w:color="999999"/>
@@ -3844,7 +3778,7 @@
         </w:tc>
         <w:tc>
           <w:tcPr>
-            <w:tcW w:w="1099" w:type="dxa"/>
+            <w:tcW w:w="1098" w:type="dxa"/>
             <w:tcBorders>
               <w:top w:val="single" w:sz="2" w:space="0" w:color="999999"/>
               <w:start w:val="single" w:sz="2" w:space="0" w:color="999999"/>
@@ -3871,7 +3805,7 @@
         </w:tc>
         <w:tc>
           <w:tcPr>
-            <w:tcW w:w="1300" w:type="dxa"/>
+            <w:tcW w:w="1301" w:type="dxa"/>
             <w:tcBorders>
               <w:top w:val="single" w:sz="2" w:space="0" w:color="999999"/>
               <w:start w:val="single" w:sz="2" w:space="0" w:color="999999"/>
@@ -3928,7 +3862,7 @@
         <w:trPr/>
         <w:tc>
           <w:tcPr>
-            <w:tcW w:w="499" w:type="dxa"/>
+            <w:tcW w:w="498" w:type="dxa"/>
             <w:tcBorders>
               <w:top w:val="single" w:sz="2" w:space="0" w:color="999999"/>
               <w:start w:val="single" w:sz="2" w:space="0" w:color="999999"/>
@@ -3955,7 +3889,7 @@
         </w:tc>
         <w:tc>
           <w:tcPr>
-            <w:tcW w:w="2201" w:type="dxa"/>
+            <w:tcW w:w="2202" w:type="dxa"/>
             <w:tcBorders>
               <w:top w:val="single" w:sz="2" w:space="0" w:color="999999"/>
               <w:start w:val="single" w:sz="2" w:space="0" w:color="999999"/>
@@ -4063,7 +3997,7 @@
         </w:tc>
         <w:tc>
           <w:tcPr>
-            <w:tcW w:w="1099" w:type="dxa"/>
+            <w:tcW w:w="1098" w:type="dxa"/>
             <w:tcBorders>
               <w:top w:val="single" w:sz="2" w:space="0" w:color="999999"/>
               <w:start w:val="single" w:sz="2" w:space="0" w:color="999999"/>
@@ -4090,7 +4024,7 @@
         </w:tc>
         <w:tc>
           <w:tcPr>
-            <w:tcW w:w="1300" w:type="dxa"/>
+            <w:tcW w:w="1301" w:type="dxa"/>
             <w:tcBorders>
               <w:top w:val="single" w:sz="2" w:space="0" w:color="999999"/>
               <w:start w:val="single" w:sz="2" w:space="0" w:color="999999"/>
@@ -4147,7 +4081,7 @@
         <w:trPr/>
         <w:tc>
           <w:tcPr>
-            <w:tcW w:w="499" w:type="dxa"/>
+            <w:tcW w:w="498" w:type="dxa"/>
             <w:tcBorders>
               <w:top w:val="single" w:sz="2" w:space="0" w:color="999999"/>
               <w:start w:val="single" w:sz="2" w:space="0" w:color="999999"/>
@@ -4174,7 +4108,7 @@
         </w:tc>
         <w:tc>
           <w:tcPr>
-            <w:tcW w:w="2201" w:type="dxa"/>
+            <w:tcW w:w="2202" w:type="dxa"/>
             <w:tcBorders>
               <w:top w:val="single" w:sz="2" w:space="0" w:color="999999"/>
               <w:start w:val="single" w:sz="2" w:space="0" w:color="999999"/>
@@ -4282,7 +4216,7 @@
         </w:tc>
         <w:tc>
           <w:tcPr>
-            <w:tcW w:w="1099" w:type="dxa"/>
+            <w:tcW w:w="1098" w:type="dxa"/>
             <w:tcBorders>
               <w:top w:val="single" w:sz="2" w:space="0" w:color="999999"/>
               <w:start w:val="single" w:sz="2" w:space="0" w:color="999999"/>
@@ -4309,7 +4243,7 @@
         </w:tc>
         <w:tc>
           <w:tcPr>
-            <w:tcW w:w="1300" w:type="dxa"/>
+            <w:tcW w:w="1301" w:type="dxa"/>
             <w:tcBorders>
               <w:top w:val="single" w:sz="2" w:space="0" w:color="999999"/>
               <w:start w:val="single" w:sz="2" w:space="0" w:color="999999"/>
@@ -4366,7 +4300,7 @@
         <w:trPr/>
         <w:tc>
           <w:tcPr>
-            <w:tcW w:w="499" w:type="dxa"/>
+            <w:tcW w:w="498" w:type="dxa"/>
             <w:tcBorders>
               <w:top w:val="single" w:sz="2" w:space="0" w:color="999999"/>
               <w:start w:val="single" w:sz="2" w:space="0" w:color="999999"/>
@@ -4393,7 +4327,7 @@
         </w:tc>
         <w:tc>
           <w:tcPr>
-            <w:tcW w:w="2201" w:type="dxa"/>
+            <w:tcW w:w="2202" w:type="dxa"/>
             <w:tcBorders>
               <w:top w:val="single" w:sz="2" w:space="0" w:color="999999"/>
               <w:start w:val="single" w:sz="2" w:space="0" w:color="999999"/>
@@ -4501,7 +4435,7 @@
         </w:tc>
         <w:tc>
           <w:tcPr>
-            <w:tcW w:w="1099" w:type="dxa"/>
+            <w:tcW w:w="1098" w:type="dxa"/>
             <w:tcBorders>
               <w:top w:val="single" w:sz="2" w:space="0" w:color="999999"/>
               <w:start w:val="single" w:sz="2" w:space="0" w:color="999999"/>
@@ -4528,7 +4462,7 @@
         </w:tc>
         <w:tc>
           <w:tcPr>
-            <w:tcW w:w="1300" w:type="dxa"/>
+            <w:tcW w:w="1301" w:type="dxa"/>
             <w:tcBorders>
               <w:top w:val="single" w:sz="2" w:space="0" w:color="999999"/>
               <w:start w:val="single" w:sz="2" w:space="0" w:color="999999"/>
@@ -4585,7 +4519,7 @@
         <w:trPr/>
         <w:tc>
           <w:tcPr>
-            <w:tcW w:w="499" w:type="dxa"/>
+            <w:tcW w:w="498" w:type="dxa"/>
             <w:tcBorders>
               <w:top w:val="single" w:sz="2" w:space="0" w:color="999999"/>
               <w:start w:val="single" w:sz="2" w:space="0" w:color="999999"/>
@@ -4612,7 +4546,7 @@
         </w:tc>
         <w:tc>
           <w:tcPr>
-            <w:tcW w:w="2201" w:type="dxa"/>
+            <w:tcW w:w="2202" w:type="dxa"/>
             <w:tcBorders>
               <w:top w:val="single" w:sz="2" w:space="0" w:color="999999"/>
               <w:start w:val="single" w:sz="2" w:space="0" w:color="999999"/>
@@ -4720,7 +4654,7 @@
         </w:tc>
         <w:tc>
           <w:tcPr>
-            <w:tcW w:w="1099" w:type="dxa"/>
+            <w:tcW w:w="1098" w:type="dxa"/>
             <w:tcBorders>
               <w:top w:val="single" w:sz="2" w:space="0" w:color="999999"/>
               <w:start w:val="single" w:sz="2" w:space="0" w:color="999999"/>
@@ -4747,7 +4681,7 @@
         </w:tc>
         <w:tc>
           <w:tcPr>
-            <w:tcW w:w="1300" w:type="dxa"/>
+            <w:tcW w:w="1301" w:type="dxa"/>
             <w:tcBorders>
               <w:top w:val="single" w:sz="2" w:space="0" w:color="999999"/>
               <w:start w:val="single" w:sz="2" w:space="0" w:color="999999"/>
@@ -4804,7 +4738,7 @@
         <w:trPr/>
         <w:tc>
           <w:tcPr>
-            <w:tcW w:w="499" w:type="dxa"/>
+            <w:tcW w:w="498" w:type="dxa"/>
             <w:tcBorders>
               <w:top w:val="single" w:sz="2" w:space="0" w:color="999999"/>
               <w:start w:val="single" w:sz="2" w:space="0" w:color="999999"/>
@@ -4831,7 +4765,7 @@
         </w:tc>
         <w:tc>
           <w:tcPr>
-            <w:tcW w:w="2201" w:type="dxa"/>
+            <w:tcW w:w="2202" w:type="dxa"/>
             <w:tcBorders>
               <w:top w:val="single" w:sz="2" w:space="0" w:color="999999"/>
               <w:start w:val="single" w:sz="2" w:space="0" w:color="999999"/>
@@ -4939,7 +4873,7 @@
         </w:tc>
         <w:tc>
           <w:tcPr>
-            <w:tcW w:w="1099" w:type="dxa"/>
+            <w:tcW w:w="1098" w:type="dxa"/>
             <w:tcBorders>
               <w:top w:val="single" w:sz="2" w:space="0" w:color="999999"/>
               <w:start w:val="single" w:sz="2" w:space="0" w:color="999999"/>
@@ -4966,7 +4900,7 @@
         </w:tc>
         <w:tc>
           <w:tcPr>
-            <w:tcW w:w="1300" w:type="dxa"/>
+            <w:tcW w:w="1301" w:type="dxa"/>
             <w:tcBorders>
               <w:top w:val="single" w:sz="2" w:space="0" w:color="999999"/>
               <w:start w:val="single" w:sz="2" w:space="0" w:color="999999"/>
@@ -5023,7 +4957,7 @@
         <w:trPr/>
         <w:tc>
           <w:tcPr>
-            <w:tcW w:w="499" w:type="dxa"/>
+            <w:tcW w:w="498" w:type="dxa"/>
             <w:tcBorders>
               <w:top w:val="single" w:sz="2" w:space="0" w:color="999999"/>
               <w:start w:val="single" w:sz="2" w:space="0" w:color="999999"/>
@@ -5050,7 +4984,7 @@
         </w:tc>
         <w:tc>
           <w:tcPr>
-            <w:tcW w:w="2201" w:type="dxa"/>
+            <w:tcW w:w="2202" w:type="dxa"/>
             <w:tcBorders>
               <w:top w:val="single" w:sz="2" w:space="0" w:color="999999"/>
               <w:start w:val="single" w:sz="2" w:space="0" w:color="999999"/>
@@ -5158,7 +5092,7 @@
         </w:tc>
         <w:tc>
           <w:tcPr>
-            <w:tcW w:w="1099" w:type="dxa"/>
+            <w:tcW w:w="1098" w:type="dxa"/>
             <w:tcBorders>
               <w:top w:val="single" w:sz="2" w:space="0" w:color="999999"/>
               <w:start w:val="single" w:sz="2" w:space="0" w:color="999999"/>
@@ -5185,7 +5119,7 @@
         </w:tc>
         <w:tc>
           <w:tcPr>
-            <w:tcW w:w="1300" w:type="dxa"/>
+            <w:tcW w:w="1301" w:type="dxa"/>
             <w:tcBorders>
               <w:top w:val="single" w:sz="2" w:space="0" w:color="999999"/>
               <w:start w:val="single" w:sz="2" w:space="0" w:color="999999"/>
@@ -5284,7 +5218,7 @@
       </w:pPr>
       <w:r>
         <w:rPr>
-          <w:rFonts w:eastAsia="Times New Roman" w:cs="Times New Roman" w:ascii="Times New Roman" w:hAnsi="Times New Roman"/>
+          <w:rFonts w:eastAsia="Times New Roman" w:cs="Times New Roman"/>
           <w:b/>
           <w:bCs/>
           <w:sz w:val="32"/>
@@ -5297,42 +5231,11 @@
       <w:pPr>
         <w:pStyle w:val="Normal"/>
         <w:spacing w:before="0" w:after="0"/>
-        <w:rPr/>
-      </w:pPr>
-      <w:r>
-        <w:rPr/>
-      </w:r>
-    </w:p>
-    <w:p>
-      <w:pPr>
-        <w:pStyle w:val="Normal"/>
-        <w:spacing w:before="0" w:after="120"/>
-        <w:rPr/>
-      </w:pPr>
-      <w:r>
-        <w:rPr>
-          <w:rFonts w:eastAsia="Times New Roman" w:cs="Times New Roman"/>
-          <w:i/>
-          <w:iCs/>
-          <w:sz w:val="24"/>
-          <w:szCs w:val="24"/>
-        </w:rPr>
-        <w:t>Banswal, D., Chaudhari, P., Das, S., &amp; Ladge, M. K. (2024). Predictive analysis of customer spending patterns using machine learning algorithms. Journal of Engineering and Technology Management, 72</w:t>
-      </w:r>
-      <w:r>
-        <w:rPr>
-          <w:rFonts w:eastAsia="Times New Roman" w:cs="Times New Roman"/>
-          <w:sz w:val="24"/>
-          <w:szCs w:val="24"/>
-        </w:rPr>
-        <w:t>, 796-813.</w:t>
-      </w:r>
-    </w:p>
-    <w:p>
-      <w:pPr>
-        <w:pStyle w:val="Normal"/>
-        <w:spacing w:before="0" w:after="0"/>
-        <w:rPr/>
+        <w:rPr>
+          <w:rFonts w:eastAsia="Times New Roman" w:cs="Times New Roman"/>
+          <w:sz w:val="24"/>
+          <w:szCs w:val="24"/>
+        </w:rPr>
       </w:pPr>
       <w:r>
         <w:rPr/>
@@ -5771,6 +5674,7 @@
     <w:qFormat/>
     <w:pPr>
       <w:widowControl/>
+      <w:suppressAutoHyphens w:val="true"/>
       <w:bidi w:val="0"/>
       <w:spacing w:before="0" w:after="0"/>
       <w:jc w:val="start"/>
@@ -5870,11 +5774,18 @@
       <w:u w:val="single"/>
     </w:rPr>
   </w:style>
-  <w:style w:type="character" w:styleId="FootnoteCharacters">
-    <w:name w:val="Footnote Characters"/>
+  <w:style w:type="character" w:styleId="FootnoteCharactersuser">
+    <w:name w:val="Footnote Characters (user)"/>
     <w:uiPriority w:val="99"/>
     <w:semiHidden/>
     <w:unhideWhenUsed/>
+    <w:qFormat/>
+    <w:rPr>
+      <w:vertAlign w:val="superscript"/>
+    </w:rPr>
+  </w:style>
+  <w:style w:type="character" w:styleId="FootnoteCharacters">
+    <w:name w:val="Footnote Characters"/>
     <w:qFormat/>
     <w:rPr>
       <w:vertAlign w:val="superscript"/>
@@ -5898,11 +5809,18 @@
       <w:szCs w:val="20"/>
     </w:rPr>
   </w:style>
-  <w:style w:type="character" w:styleId="EndnoteCharacters">
-    <w:name w:val="Endnote Characters"/>
+  <w:style w:type="character" w:styleId="EndnoteCharactersuser">
+    <w:name w:val="Endnote Characters (user)"/>
     <w:uiPriority w:val="99"/>
     <w:semiHidden/>
     <w:unhideWhenUsed/>
+    <w:qFormat/>
+    <w:rPr>
+      <w:vertAlign w:val="superscript"/>
+    </w:rPr>
+  </w:style>
+  <w:style w:type="character" w:styleId="EndnoteCharacters">
+    <w:name w:val="Endnote Characters"/>
     <w:qFormat/>
     <w:rPr>
       <w:vertAlign w:val="superscript"/>
@@ -6007,6 +5925,7 @@
     <w:qFormat/>
     <w:pPr>
       <w:widowControl/>
+      <w:suppressAutoHyphens w:val="true"/>
       <w:bidi w:val="0"/>
       <w:spacing w:before="0" w:after="0"/>
       <w:jc w:val="start"/>
@@ -6027,6 +5946,7 @@
     <w:qFormat/>
     <w:pPr>
       <w:widowControl/>
+      <w:suppressAutoHyphens w:val="true"/>
       <w:bidi w:val="0"/>
       <w:spacing w:before="0" w:after="0"/>
       <w:jc w:val="start"/>

</xml_diff>